<commit_message>
Complete Lab 7 release tasks
Co-authored-by: Copilot <223556219+Copilot@users.noreply.github.com>
</commit_message>
<xml_diff>
--- a/Docs/Observaciones-Lab7.docx
+++ b/Docs/Observaciones-Lab7.docx
@@ -181,6 +181,9 @@
           <w:lang w:val="es-CO"/>
         </w:rPr>
       </w:pPr>
+      <w:r>
+        <w:t>Respuesta: La altura no queda determinada únicamente por el número de elementos; también depende de la forma del árbol y del orden de inserción. Un BST balanceado tiene una altura cercana a log2(n), mientras que uno degenerado (similar a una lista) puede alcanzar altura n. Este árbol no se balancea automáticamente.</w:t>
+      </w:r>
     </w:p>
     <w:p>
       <w:pPr>
@@ -239,6 +242,9 @@
           <w:lang w:val="es-CO"/>
         </w:rPr>
       </w:pPr>
+      <w:r>
+        <w:t>Respuesta: Para consultar un rango de fechas, el BST aprovecha el orden de sus llaves: la búsqueda visita las ramas pertinentes y cuesta O(h + k), donde h es la altura y k la cantidad de fechas encontradas (O(log n + k) si está balanceado; O(n) en el peor caso). Una tabla hash ofrece O(1) promedio para una fecha exacta, pero no mantiene las fechas ordenadas; para un rango habría que revisar potencialmente todas las n fechas, O(n). Por eso, para rangos selectivos un BST balanceado suele responder más rápido.</w:t>
+      </w:r>
     </w:p>
     <w:p>
       <w:pPr>
@@ -280,6 +286,9 @@
           <w:lang w:val="es-CO"/>
         </w:rPr>
       </w:pPr>
+      <w:r>
+        <w:t>Respuesta: Se utiliza keys(BST, fechaInicial, fechaFinal), que recorre en orden las llaves dentro del rango. Para obtener los valores asociados se puede utilizar values(BST, fechaInicial, fechaFinal); en la consulta de la aplicación se obtienen las fechas con keys y luego se recupera cada entrada con get.</w:t>
+      </w:r>
     </w:p>
     <w:p>
       <w:pPr>

</xml_diff>

<commit_message>
Add CSV-validated Lab 7 observations
Co-authored-by: Copilot <223556219+Copilot@users.noreply.github.com>
</commit_message>
<xml_diff>
--- a/Docs/Observaciones-Lab7.docx
+++ b/Docs/Observaciones-Lab7.docx
@@ -182,7 +182,7 @@
         </w:rPr>
       </w:pPr>
       <w:r>
-        <w:t>Respuesta: La altura no queda determinada únicamente por el número de elementos; también depende de la forma del árbol y del orden de inserción. Un BST balanceado tiene una altura cercana a log2(n), mientras que uno degenerado (similar a una lista) puede alcanzar altura n. Este árbol no se balancea automáticamente.</w:t>
+        <w:t>Respuesta: La altura depende de la cantidad de llaves y de la forma del árbol, que a su vez depende del orden de inserción. Un BST balanceado tiene altura O(log n); un BST sin balanceo puede llegar a O(n). Con el CSV Boston Crimes se cargaron 319.073 crímenes en 1.177 fechas y el árbol alcanzó altura 30; las fechas van de 2015-06-15 a 2018-09-03. Esto muestra que la altura no se deduce solo del número de elementos.</w:t>
       </w:r>
     </w:p>
     <w:p>
@@ -243,7 +243,7 @@
         </w:rPr>
       </w:pPr>
       <w:r>
-        <w:t>Respuesta: Para consultar un rango de fechas, el BST aprovecha el orden de sus llaves: la búsqueda visita las ramas pertinentes y cuesta O(h + k), donde h es la altura y k la cantidad de fechas encontradas (O(log n + k) si está balanceado; O(n) en el peor caso). Una tabla hash ofrece O(1) promedio para una fecha exacta, pero no mantiene las fechas ordenadas; para un rango habría que revisar potencialmente todas las n fechas, O(n). Por eso, para rangos selectivos un BST balanceado suele responder más rápido.</w:t>
+        <w:t>Respuesta: Para una fecha exacta, una tabla hash ofrece O(1) promedio; para un rango no conserva el orden, por lo que habría que revisar todas las fechas (O(d), d = cantidad de fechas). El BST puede podar ramas y recorrer las llaves del rango en O(h + k), donde h es la altura y k las fechas encontradas (peor caso O(d)). Con el CSV, la opción 3 para 2017-01-01 a 2018-01-01 encontró 101.143 crímenes.</w:t>
       </w:r>
     </w:p>
     <w:p>
@@ -287,7 +287,7 @@
         </w:rPr>
       </w:pPr>
       <w:r>
-        <w:t>Respuesta: Se utiliza keys(BST, fechaInicial, fechaFinal), que recorre en orden las llaves dentro del rango. Para obtener los valores asociados se puede utilizar values(BST, fechaInicial, fechaFinal); en la consulta de la aplicación se obtienen las fechas con keys y luego se recupera cada entrada con get.</w:t>
+        <w:t>Respuesta: La operación keys(BST, fechaInicial, fechaFinal) devuelve en orden las llaves dentro del rango; values(BST, fechaInicial, fechaFinal) devuelve sus valores. La consulta de la aplicación usa keys y luego get para sumar los crímenes de cada fecha. En el CSV, la opción 4 para Vandalism el 2017-01-01 devolvió 12 crímenes.</w:t>
       </w:r>
     </w:p>
     <w:p>

</xml_diff>